<commit_message>
Add §4.7 Statistical Significance: t-stat 7.48, bootstrap 95% CI [2.17, 4.75]
</commit_message>
<xml_diff>
--- a/paper7/paper7_final.docx
+++ b/paper7/paper7_final.docx
@@ -2,7 +2,7 @@
 <file path=word/document.xml><?xml version="1.0" encoding="utf-8"?>
 <w:document xmlns:w="http://schemas.openxmlformats.org/wordprocessingml/2006/main" xmlns:m="http://schemas.openxmlformats.org/officeDocument/2006/math" xmlns:r="http://schemas.openxmlformats.org/officeDocument/2006/relationships" xmlns:o="urn:schemas-microsoft-com:office:office" xmlns:v="urn:schemas-microsoft-com:vml" xmlns:w10="urn:schemas-microsoft-com:office:word" xmlns:a="http://schemas.openxmlformats.org/drawingml/2006/main" xmlns:pic="http://schemas.openxmlformats.org/drawingml/2006/picture" xmlns:wp="http://schemas.openxmlformats.org/drawingml/2006/wordprocessingDrawing">
   <w:body>
-    <w:bookmarkStart w:id="94" w:name="X1206e37cdab7ce615faa454bcc7fa8315a784d3"/>
+    <w:bookmarkStart w:id="95" w:name="X1206e37cdab7ce615faa454bcc7fa8315a784d3"/>
     <w:p>
       <w:pPr>
         <w:pStyle w:val="Heading1"/>
@@ -2469,7 +2469,7 @@
     </w:p>
     <w:bookmarkEnd w:id="48"/>
     <w:bookmarkEnd w:id="49"/>
-    <w:bookmarkStart w:id="59" w:name="X121719332867ee227f0a04b486098cee978c6e6"/>
+    <w:bookmarkStart w:id="60" w:name="X121719332867ee227f0a04b486098cee978c6e6"/>
     <w:p>
       <w:pPr>
         <w:pStyle w:val="Heading2"/>
@@ -4403,8 +4403,34 @@
       </w:r>
     </w:p>
     <w:bookmarkEnd w:id="58"/>
+    <w:bookmarkStart w:id="59" w:name="Xf675a7a3a74326be03a9f39807335edddbc84c4"/>
+    <w:p>
+      <w:pPr>
+        <w:pStyle w:val="Heading3"/>
+      </w:pPr>
+      <w:r>
+        <w:t xml:space="preserve">4.7 Statistical Significance</w:t>
+      </w:r>
+    </w:p>
+    <w:p>
+      <w:pPr>
+        <w:pStyle w:val="FirstParagraph"/>
+      </w:pPr>
+      <w:r>
+        <w:t xml:space="preserve">The Config D strategy's mean per-trade P&amp;L of ₹3,955 over 193 trades yields a t-statistic of 7.48 against the null hypothesis of zero mean (p &lt; 10⁻¹³), far beyond the conventional significance threshold. A 10,000-draw bootstrap resample of the trade log produces a 95% confidence interval for the annualized Sharpe ratio of [2.17, 4.75], with a bootstrap median of 2.88. Every one of the 10,000 resamples produces a positive Sharpe; 99.4% produce a Sharpe above 2.0. The point estimate of 2.82 (matching the 2.835 reported above, with rounding) sits comfortably inside the interval.</w:t>
+      </w:r>
+    </w:p>
+    <w:p>
+      <w:pPr>
+        <w:pStyle w:val="BodyText"/>
+      </w:pPr>
+      <w:r>
+        <w:t xml:space="preserve">These results indicate that the reported performance is not an artefact of sampling variability. The confidence interval for the Sharpe ratio does not include zero, does not include 1.0, and sits well above the thresholds conventionally considered economically meaningful. The strategy's edge is statistically robust across every reasonable reweighting of the historical trade sample.</w:t>
+      </w:r>
+    </w:p>
     <w:bookmarkEnd w:id="59"/>
-    <w:bookmarkStart w:id="67" w:name="X735612638e4e736e4693e459c258977262c0dfc"/>
+    <w:bookmarkEnd w:id="60"/>
+    <w:bookmarkStart w:id="68" w:name="X735612638e4e736e4693e459c258977262c0dfc"/>
     <w:p>
       <w:pPr>
         <w:pStyle w:val="Heading2"/>
@@ -4413,7 +4439,7 @@
         <w:t xml:space="preserve">5. Discussion</w:t>
       </w:r>
     </w:p>
-    <w:bookmarkStart w:id="60" w:name="X920f0480d2c28935aeef48d3e8b727d0a0c4a4c"/>
+    <w:bookmarkStart w:id="61" w:name="X920f0480d2c28935aeef48d3e8b727d0a0c4a4c"/>
     <w:p>
       <w:pPr>
         <w:pStyle w:val="Heading3"/>
@@ -4438,8 +4464,8 @@
         <w:t xml:space="preserve">This result is not obvious. The theoretical literature suggests that tail hedges are expensive, and empirical work has found that the cost of protection often exceeds the benefit [11]. What makes the NIFTY credit spread different is the combination of three factors: the volatility risk premium is large, the transaction costs are modest relative to the credit received, and the hedge strike can be chosen to be far enough out of the money to be cheap but close enough to provide meaningful protection.</w:t>
       </w:r>
     </w:p>
-    <w:bookmarkEnd w:id="60"/>
-    <w:bookmarkStart w:id="61" w:name="Xd31e5a41e9913f4ad6d74bcaef4adad58586151"/>
+    <w:bookmarkEnd w:id="61"/>
+    <w:bookmarkStart w:id="62" w:name="Xd31e5a41e9913f4ad6d74bcaef4adad58586151"/>
     <w:p>
       <w:pPr>
         <w:pStyle w:val="Heading3"/>
@@ -4472,8 +4498,8 @@
         <w:t xml:space="preserve">This finding has practical implications. Traders often treat risk controls as independent, adding more of them as a way of reducing risk. Our results suggest that risk controls can be redundant, and that the interaction between them matters.</w:t>
       </w:r>
     </w:p>
-    <w:bookmarkEnd w:id="61"/>
-    <w:bookmarkStart w:id="62" w:name="X3cb758129fc85ce5cb1cf3795d00230fc14ed04"/>
+    <w:bookmarkEnd w:id="62"/>
+    <w:bookmarkStart w:id="63" w:name="X3cb758129fc85ce5cb1cf3795d00230fc14ed04"/>
     <w:p>
       <w:pPr>
         <w:pStyle w:val="Heading3"/>
@@ -4506,8 +4532,8 @@
         <w:t xml:space="preserve">The failure of the weekly rolling hedge is consistent with the literature on gap risk [12]. The gap is precisely the event the hedge is supposed to cover, but rolling structures leave the position unprotected during it. This is a structural problem with rolling hedges that no amount of parameter tuning can solve.</w:t>
       </w:r>
     </w:p>
-    <w:bookmarkEnd w:id="62"/>
-    <w:bookmarkStart w:id="63" w:name="X56119e650a0ef8f44d765164180b549dc98bb74"/>
+    <w:bookmarkEnd w:id="63"/>
+    <w:bookmarkStart w:id="64" w:name="X56119e650a0ef8f44d765164180b549dc98bb74"/>
     <w:p>
       <w:pPr>
         <w:pStyle w:val="Heading3"/>
@@ -4540,8 +4566,8 @@
         <w:t xml:space="preserve">The finding that simpler hedges outperform more complex ones after transaction costs is also important. Many practitioners assume that more sophistication leads to better risk management. Our results suggest the opposite for this strategy: a single same-expiry put beats both the rolling hedge and the laddered hedge.</w:t>
       </w:r>
     </w:p>
-    <w:bookmarkEnd w:id="63"/>
-    <w:bookmarkStart w:id="64" w:name="X57a5298f4090be87cbb19e82bbf4f95e480768e"/>
+    <w:bookmarkEnd w:id="64"/>
+    <w:bookmarkStart w:id="65" w:name="X57a5298f4090be87cbb19e82bbf4f95e480768e"/>
     <w:p>
       <w:pPr>
         <w:pStyle w:val="Heading3"/>
@@ -5046,8 +5072,8 @@
         <w:t xml:space="preserve">We also tested a conditional variant in which the long put was activated only when the entry-day VIX percentile exceeded thresholds of 0.40, 0.50, or 0.60. All three variants underperformed the unconditional hedge on Sharpe ratio. The unconditional hedge is retained.</w:t>
       </w:r>
     </w:p>
-    <w:bookmarkEnd w:id="64"/>
-    <w:bookmarkStart w:id="65" w:name="X268c916b26bbeb1e0111743927fd75743ff83ab"/>
+    <w:bookmarkEnd w:id="65"/>
+    <w:bookmarkStart w:id="66" w:name="X268c916b26bbeb1e0111743927fd75743ff83ab"/>
     <w:p>
       <w:pPr>
         <w:pStyle w:val="Heading3"/>
@@ -5104,8 +5130,8 @@
         <w:t xml:space="preserve">Fifth, the sample size is limited. Seven years of data provides 196 trades, which is sufficient for statistical inference but not for precise estimation of tail behavior. The tail events we observe are drawn from a single realization of the market process.</w:t>
       </w:r>
     </w:p>
-    <w:bookmarkEnd w:id="65"/>
-    <w:bookmarkStart w:id="66" w:name="X1fa1767e4233d7a9c5cda4b410bb217eb5ce742"/>
+    <w:bookmarkEnd w:id="66"/>
+    <w:bookmarkStart w:id="67" w:name="X1fa1767e4233d7a9c5cda4b410bb217eb5ce742"/>
     <w:p>
       <w:pPr>
         <w:pStyle w:val="Heading3"/>
@@ -5161,9 +5187,9 @@
         </w:pict>
       </w:r>
     </w:p>
-    <w:bookmarkEnd w:id="66"/>
     <w:bookmarkEnd w:id="67"/>
-    <w:bookmarkStart w:id="68" w:name="X6b297cc947e0db5526be369b1f0f4ddc67b2415"/>
+    <w:bookmarkEnd w:id="68"/>
+    <w:bookmarkStart w:id="69" w:name="X6b297cc947e0db5526be369b1f0f4ddc67b2415"/>
     <w:p>
       <w:pPr>
         <w:pStyle w:val="Heading2"/>
@@ -5203,8 +5229,8 @@
         </w:pict>
       </w:r>
     </w:p>
-    <w:bookmarkEnd w:id="68"/>
-    <w:bookmarkStart w:id="70" w:name="data-and-code-availability"/>
+    <w:bookmarkEnd w:id="69"/>
+    <w:bookmarkStart w:id="71" w:name="data-and-code-availability"/>
     <w:p>
       <w:pPr>
         <w:pStyle w:val="Heading2"/>
@@ -5223,7 +5249,7 @@
       <w:r>
         <w:t xml:space="preserve"> </w:t>
       </w:r>
-      <w:hyperlink r:id="rId69">
+      <w:hyperlink r:id="rId70">
         <w:r>
           <w:rPr>
             <w:rStyle w:val="Hyperlink"/>
@@ -5325,8 +5351,8 @@
         <w:t xml:space="preserve">; recomputing Sharpe from the per-trade log with annualization by √(trades/year) reproduces the reported 2.835. Raw NSE data is available from NSE archives subject to their licensing terms.</w:t>
       </w:r>
     </w:p>
-    <w:bookmarkEnd w:id="70"/>
-    <w:bookmarkStart w:id="71" w:name="author-contribution-statement"/>
+    <w:bookmarkEnd w:id="71"/>
+    <w:bookmarkStart w:id="72" w:name="author-contribution-statement"/>
     <w:p>
       <w:pPr>
         <w:pStyle w:val="Heading2"/>
@@ -5343,8 +5369,8 @@
         <w:t xml:space="preserve">Both authors designed the study. P.R.A. implemented all code, ran experiments, and drafted the manuscript. O.S.N. supervised the research and edited the manuscript.</w:t>
       </w:r>
     </w:p>
-    <w:bookmarkEnd w:id="71"/>
-    <w:bookmarkStart w:id="72" w:name="competing-interests"/>
+    <w:bookmarkEnd w:id="72"/>
+    <w:bookmarkStart w:id="73" w:name="competing-interests"/>
     <w:p>
       <w:pPr>
         <w:pStyle w:val="Heading2"/>
@@ -5361,8 +5387,8 @@
         <w:t xml:space="preserve">The authors declare no competing interests.</w:t>
       </w:r>
     </w:p>
-    <w:bookmarkEnd w:id="72"/>
-    <w:bookmarkStart w:id="73" w:name="ethics-statement"/>
+    <w:bookmarkEnd w:id="73"/>
+    <w:bookmarkStart w:id="74" w:name="ethics-statement"/>
     <w:p>
       <w:pPr>
         <w:pStyle w:val="Heading2"/>
@@ -5379,8 +5405,8 @@
         <w:t xml:space="preserve">This research used only publicly available historical market data. No human subjects were involved.</w:t>
       </w:r>
     </w:p>
-    <w:bookmarkEnd w:id="73"/>
-    <w:bookmarkStart w:id="74" w:name="funding"/>
+    <w:bookmarkEnd w:id="74"/>
+    <w:bookmarkStart w:id="75" w:name="funding"/>
     <w:p>
       <w:pPr>
         <w:pStyle w:val="Heading2"/>
@@ -5404,8 +5430,8 @@
         </w:pict>
       </w:r>
     </w:p>
-    <w:bookmarkEnd w:id="74"/>
-    <w:bookmarkStart w:id="93" w:name="references"/>
+    <w:bookmarkEnd w:id="75"/>
+    <w:bookmarkStart w:id="94" w:name="references"/>
     <w:p>
       <w:pPr>
         <w:pStyle w:val="Heading2"/>
@@ -5450,7 +5476,7 @@
       <w:r>
         <w:t xml:space="preserve"> </w:t>
       </w:r>
-      <w:hyperlink r:id="rId75">
+      <w:hyperlink r:id="rId76">
         <w:r>
           <w:rPr>
             <w:rStyle w:val="Hyperlink"/>
@@ -5495,7 +5521,7 @@
       <w:r>
         <w:t xml:space="preserve"> </w:t>
       </w:r>
-      <w:hyperlink r:id="rId76">
+      <w:hyperlink r:id="rId77">
         <w:r>
           <w:rPr>
             <w:rStyle w:val="Hyperlink"/>
@@ -5540,7 +5566,7 @@
       <w:r>
         <w:t xml:space="preserve"> </w:t>
       </w:r>
-      <w:hyperlink r:id="rId77">
+      <w:hyperlink r:id="rId78">
         <w:r>
           <w:rPr>
             <w:rStyle w:val="Hyperlink"/>
@@ -5585,7 +5611,7 @@
       <w:r>
         <w:t xml:space="preserve"> </w:t>
       </w:r>
-      <w:hyperlink r:id="rId78">
+      <w:hyperlink r:id="rId79">
         <w:r>
           <w:rPr>
             <w:rStyle w:val="Hyperlink"/>
@@ -5630,7 +5656,7 @@
       <w:r>
         <w:t xml:space="preserve"> </w:t>
       </w:r>
-      <w:hyperlink r:id="rId79">
+      <w:hyperlink r:id="rId80">
         <w:r>
           <w:rPr>
             <w:rStyle w:val="Hyperlink"/>
@@ -5662,7 +5688,7 @@
       <w:r>
         <w:t xml:space="preserve"> </w:t>
       </w:r>
-      <w:hyperlink r:id="rId80">
+      <w:hyperlink r:id="rId81">
         <w:r>
           <w:rPr>
             <w:rStyle w:val="Hyperlink"/>
@@ -5707,7 +5733,7 @@
       <w:r>
         <w:t xml:space="preserve"> </w:t>
       </w:r>
-      <w:hyperlink r:id="rId81">
+      <w:hyperlink r:id="rId82">
         <w:r>
           <w:rPr>
             <w:rStyle w:val="Hyperlink"/>
@@ -5752,7 +5778,7 @@
       <w:r>
         <w:t xml:space="preserve"> </w:t>
       </w:r>
-      <w:hyperlink r:id="rId82">
+      <w:hyperlink r:id="rId83">
         <w:r>
           <w:rPr>
             <w:rStyle w:val="Hyperlink"/>
@@ -5797,7 +5823,7 @@
       <w:r>
         <w:t xml:space="preserve"> </w:t>
       </w:r>
-      <w:hyperlink r:id="rId83">
+      <w:hyperlink r:id="rId84">
         <w:r>
           <w:rPr>
             <w:rStyle w:val="Hyperlink"/>
@@ -5842,7 +5868,7 @@
       <w:r>
         <w:t xml:space="preserve"> </w:t>
       </w:r>
-      <w:hyperlink r:id="rId84">
+      <w:hyperlink r:id="rId85">
         <w:r>
           <w:rPr>
             <w:rStyle w:val="Hyperlink"/>
@@ -5887,7 +5913,7 @@
       <w:r>
         <w:t xml:space="preserve"> </w:t>
       </w:r>
-      <w:hyperlink r:id="rId85">
+      <w:hyperlink r:id="rId86">
         <w:r>
           <w:rPr>
             <w:rStyle w:val="Hyperlink"/>
@@ -5932,7 +5958,7 @@
       <w:r>
         <w:t xml:space="preserve"> </w:t>
       </w:r>
-      <w:hyperlink r:id="rId86">
+      <w:hyperlink r:id="rId87">
         <w:r>
           <w:rPr>
             <w:rStyle w:val="Hyperlink"/>
@@ -5985,7 +6011,7 @@
       <w:r>
         <w:t xml:space="preserve"> </w:t>
       </w:r>
-      <w:hyperlink r:id="rId87">
+      <w:hyperlink r:id="rId88">
         <w:r>
           <w:rPr>
             <w:rStyle w:val="Hyperlink"/>
@@ -6017,7 +6043,7 @@
       <w:r>
         <w:t xml:space="preserve"> </w:t>
       </w:r>
-      <w:hyperlink r:id="rId87">
+      <w:hyperlink r:id="rId88">
         <w:r>
           <w:rPr>
             <w:rStyle w:val="Hyperlink"/>
@@ -6049,7 +6075,7 @@
       <w:r>
         <w:t xml:space="preserve"> </w:t>
       </w:r>
-      <w:hyperlink r:id="rId88">
+      <w:hyperlink r:id="rId89">
         <w:r>
           <w:rPr>
             <w:rStyle w:val="Hyperlink"/>
@@ -6094,7 +6120,7 @@
       <w:r>
         <w:t xml:space="preserve"> </w:t>
       </w:r>
-      <w:hyperlink r:id="rId89">
+      <w:hyperlink r:id="rId90">
         <w:r>
           <w:rPr>
             <w:rStyle w:val="Hyperlink"/>
@@ -6139,7 +6165,7 @@
       <w:r>
         <w:t xml:space="preserve"> </w:t>
       </w:r>
-      <w:hyperlink r:id="rId90">
+      <w:hyperlink r:id="rId91">
         <w:r>
           <w:rPr>
             <w:rStyle w:val="Hyperlink"/>
@@ -6174,7 +6200,7 @@
       <w:r>
         <w:t xml:space="preserve"> </w:t>
       </w:r>
-      <w:hyperlink r:id="rId91">
+      <w:hyperlink r:id="rId92">
         <w:r>
           <w:rPr>
             <w:rStyle w:val="Hyperlink"/>
@@ -6219,7 +6245,7 @@
       <w:r>
         <w:t xml:space="preserve"> </w:t>
       </w:r>
-      <w:hyperlink r:id="rId92">
+      <w:hyperlink r:id="rId93">
         <w:r>
           <w:rPr>
             <w:rStyle w:val="Hyperlink"/>
@@ -6228,8 +6254,8 @@
         </w:r>
       </w:hyperlink>
     </w:p>
-    <w:bookmarkEnd w:id="93"/>
     <w:bookmarkEnd w:id="94"/>
+    <w:bookmarkEnd w:id="95"/>
     <w:sectPr/>
   </w:body>
 </w:document>

</xml_diff>

<commit_message>
Add design-space exploration paragraph to Paper 7 Future Work
</commit_message>
<xml_diff>
--- a/paper7/paper7_final.docx
+++ b/paper7/paper7_final.docx
@@ -5178,6 +5178,24 @@
       </w:pPr>
       <w:r>
         <w:t xml:space="preserve">Fourth, investigate dynamic hedge strikes based on VIX levels. During periods of elevated volatility, a closer strike may be optimal; during calm periods, a further strike may be preferred. This is a natural extension of the framework.</w:t>
+      </w:r>
+    </w:p>
+    <w:p>
+      <w:pPr>
+        <w:pStyle w:val="BodyText"/>
+      </w:pPr>
+      <w:r>
+        <w:rPr>
+          <w:bCs/>
+          <w:b/>
+        </w:rPr>
+        <w:t xml:space="preserve">Design-space exploration.</w:t>
+      </w:r>
+      <w:r>
+        <w:t xml:space="preserve"> </w:t>
+      </w:r>
+      <w:r>
+        <w:t xml:space="preserve">Across eleven structural variants tested on top of the Config D baseline — alternative hedge structures (VIX-scaled hedge), profit-taking rules (50% and 75% of maximum profit), delta values from 0.20 to 0.35, VRP-based position sizing, regime-conditional entry, and a VIX call overlay — none produced a Sharpe improvement statistically distinguishable from the baseline's 2.835 at 95% confidence. The baseline's 95% bootstrap confidence interval is [2.17, 4.75], and every variant's confidence interval overlapped substantially with it. The single largest point-estimate improvement came from VRP-based sizing (Sharpe 3.32 versus 2.83), which is directly motivated by the program's central thesis: the Volatility Risk Premium. However, the improvement is within statistical noise at this sample size. These results suggest that the Config D design sits at a local optimum within the NIFTY 50 options framework tested, and that further improvement is more likely to come from new data sources (actual option chain data rather than Black-Scholes with VIX) than from parametric tuning of the existing design.</w:t>
       </w:r>
     </w:p>
     <w:p>

</xml_diff>